<commit_message>
gitleaks tflint tfsec infracost worklow added
</commit_message>
<xml_diff>
--- a/documents/Gitleaks_Complete_Setup_Commands.docx
+++ b/documents/Gitleaks_Complete_Setup_Commands.docx
@@ -53,6 +53,9 @@
         <w:t xml:space="preserve">Temporary PATH: </w:t>
       </w:r>
       <w:r>
+        <w:rPr>
+          <w:highlight w:val="yellow"/>
+        </w:rPr>
         <w:t>$env:Path += ";C:\Tools"</w:t>
       </w:r>
     </w:p>
@@ -646,55 +649,135 @@
         <w:pStyle w:val="Heading1"/>
       </w:pPr>
       <w:r>
-        <w:t>10</w:t>
-      </w:r>
-      <w:r>
-        <w:t xml:space="preserve">. </w:t>
-      </w:r>
-      <w:r>
-        <w:t>To remove git leaks</w:t>
+        <w:t>10. To remove git leaks</w:t>
       </w:r>
     </w:p>
     <w:p>
       <w:r>
-        <w:t>Remove-</w:t>
-      </w:r>
-      <w:proofErr w:type="gramStart"/>
-      <w:r>
-        <w:t>Item .git</w:t>
-      </w:r>
-      <w:proofErr w:type="gramEnd"/>
-      <w:r>
-        <w:t>\hooks\pre-commit</w:t>
+        <w:t>Remove-Item .git\hooks\pre-commit</w:t>
       </w:r>
     </w:p>
     <w:p>
       <w:r>
-        <w:t>Test-</w:t>
-      </w:r>
-      <w:proofErr w:type="gramStart"/>
-      <w:r>
-        <w:t>Path .git</w:t>
-      </w:r>
-      <w:proofErr w:type="gramEnd"/>
-      <w:r>
-        <w:t>\hooks\pre-commit</w:t>
+        <w:t>Test-Path .git\hooks\pre-commit</w:t>
       </w:r>
       <w:r>
-        <w:t xml:space="preserve">                   </w:t>
-      </w:r>
-      <w:proofErr w:type="gramStart"/>
-      <w:r>
-        <w:t>expected :</w:t>
-      </w:r>
-      <w:proofErr w:type="gramEnd"/>
-      <w:r>
-        <w:t xml:space="preserve"> </w:t>
+        <w:t xml:space="preserve">                   expected : </w:t>
       </w:r>
       <w:r>
         <w:t>False</w:t>
       </w:r>
     </w:p>
+    <w:p/>
+    <w:p>
+      <w:pPr>
+        <w:pStyle w:val="Heading1"/>
+      </w:pPr>
+      <w:r>
+        <w:t xml:space="preserve">For </w:t>
+      </w:r>
+      <w:proofErr w:type="spellStart"/>
+      <w:r>
+        <w:t>TFLint</w:t>
+      </w:r>
+      <w:proofErr w:type="spellEnd"/>
+    </w:p>
+    <w:p/>
+    <w:p>
+      <w:proofErr w:type="spellStart"/>
+      <w:r>
+        <w:t>tflint</w:t>
+      </w:r>
+      <w:proofErr w:type="spellEnd"/>
+      <w:r>
+        <w:t xml:space="preserve"> </w:t>
+      </w:r>
+      <w:r>
+        <w:t>–</w:t>
+      </w:r>
+      <w:proofErr w:type="spellStart"/>
+      <w:r>
+        <w:t>init</w:t>
+      </w:r>
+      <w:proofErr w:type="spellEnd"/>
+    </w:p>
+    <w:p>
+      <w:proofErr w:type="spellStart"/>
+      <w:r>
+        <w:t>tflint</w:t>
+      </w:r>
+      <w:proofErr w:type="spellEnd"/>
+    </w:p>
+    <w:p>
+      <w:r>
+        <w:t>$</w:t>
+      </w:r>
+      <w:proofErr w:type="spellStart"/>
+      <w:r>
+        <w:t>env:Path</w:t>
+      </w:r>
+      <w:proofErr w:type="spellEnd"/>
+      <w:r>
+        <w:t xml:space="preserve"> = "C:\Tools;" + $</w:t>
+      </w:r>
+      <w:proofErr w:type="spellStart"/>
+      <w:r>
+        <w:t>env:Path</w:t>
+      </w:r>
+      <w:proofErr w:type="spellEnd"/>
+    </w:p>
+    <w:p/>
+    <w:p>
+      <w:pPr>
+        <w:pStyle w:val="Heading1"/>
+      </w:pPr>
+    </w:p>
+    <w:p>
+      <w:pPr>
+        <w:pStyle w:val="Heading1"/>
+      </w:pPr>
+      <w:r>
+        <w:t xml:space="preserve">For </w:t>
+      </w:r>
+      <w:proofErr w:type="spellStart"/>
+      <w:r>
+        <w:t>Tfsec</w:t>
+      </w:r>
+      <w:proofErr w:type="spellEnd"/>
+    </w:p>
+    <w:p/>
+    <w:p>
+      <w:r>
+        <w:t>Rename-Item "C:\Tools\tfsec-windows-amd64.exe" "tfsec.exe"</w:t>
+      </w:r>
+    </w:p>
+    <w:p>
+      <w:proofErr w:type="spellStart"/>
+      <w:r>
+        <w:t>tfsec</w:t>
+      </w:r>
+      <w:proofErr w:type="spellEnd"/>
+      <w:r>
+        <w:t xml:space="preserve"> </w:t>
+      </w:r>
+      <w:r>
+        <w:t>–</w:t>
+      </w:r>
+      <w:r>
+        <w:t>version</w:t>
+      </w:r>
+    </w:p>
+    <w:p>
+      <w:proofErr w:type="spellStart"/>
+      <w:r>
+        <w:t>tfsec</w:t>
+      </w:r>
+      <w:proofErr w:type="spellEnd"/>
+      <w:r>
+        <w:t xml:space="preserve"> .</w:t>
+      </w:r>
+    </w:p>
+    <w:p/>
     <w:p/>
     <w:sectPr>
       <w:pgSz w:w="12240" w:h="15840"/>

</xml_diff>